<commit_message>
add bot testing seq
</commit_message>
<xml_diff>
--- a/wk4-clapping-bot.docx
+++ b/wk4-clapping-bot.docx
@@ -121,6 +121,7 @@
       <w:pPr>
         <w:pStyle w:val="Normal"/>
         <w:bidi w:val="0"/>
+        <w:spacing w:before="0" w:after="0"/>
         <w:jc w:val="start"/>
         <w:rPr/>
       </w:pPr>
@@ -324,7 +325,6 @@
           <w:numId w:val="2"/>
         </w:numPr>
         <w:tabs>
-          <w:tab w:val="clear" w:pos="709"/>
           <w:tab w:val="left" w:pos="709" w:leader="none"/>
         </w:tabs>
         <w:bidi w:val="0"/>
@@ -355,7 +355,6 @@
           <w:numId w:val="2"/>
         </w:numPr>
         <w:tabs>
-          <w:tab w:val="clear" w:pos="709"/>
           <w:tab w:val="left" w:pos="709" w:leader="none"/>
         </w:tabs>
         <w:bidi w:val="0"/>
@@ -944,7 +943,6 @@
           <w:numId w:val="4"/>
         </w:numPr>
         <w:tabs>
-          <w:tab w:val="clear" w:pos="709"/>
           <w:tab w:val="left" w:pos="709" w:leader="none"/>
         </w:tabs>
         <w:bidi w:val="0"/>
@@ -981,7 +979,6 @@
           <w:numId w:val="4"/>
         </w:numPr>
         <w:tabs>
-          <w:tab w:val="clear" w:pos="709"/>
           <w:tab w:val="left" w:pos="709" w:leader="none"/>
         </w:tabs>
         <w:bidi w:val="0"/>
@@ -1028,7 +1025,6 @@
           <w:numId w:val="4"/>
         </w:numPr>
         <w:tabs>
-          <w:tab w:val="clear" w:pos="709"/>
           <w:tab w:val="left" w:pos="709" w:leader="none"/>
         </w:tabs>
         <w:bidi w:val="0"/>
@@ -1193,7 +1189,6 @@
           <w:numId w:val="4"/>
         </w:numPr>
         <w:tabs>
-          <w:tab w:val="clear" w:pos="709"/>
           <w:tab w:val="left" w:pos="709" w:leader="none"/>
         </w:tabs>
         <w:bidi w:val="0"/>
@@ -1286,7 +1281,6 @@
           <w:numId w:val="5"/>
         </w:numPr>
         <w:tabs>
-          <w:tab w:val="clear" w:pos="709"/>
           <w:tab w:val="left" w:pos="709" w:leader="none"/>
         </w:tabs>
         <w:bidi w:val="0"/>
@@ -1307,7 +1301,6 @@
           <w:numId w:val="5"/>
         </w:numPr>
         <w:tabs>
-          <w:tab w:val="clear" w:pos="709"/>
           <w:tab w:val="left" w:pos="709" w:leader="none"/>
         </w:tabs>
         <w:bidi w:val="0"/>
@@ -1435,7 +1428,6 @@
           <w:numId w:val="5"/>
         </w:numPr>
         <w:tabs>
-          <w:tab w:val="clear" w:pos="709"/>
           <w:tab w:val="left" w:pos="709" w:leader="none"/>
         </w:tabs>
         <w:bidi w:val="0"/>
@@ -1536,7 +1528,6 @@
           <w:numId w:val="3"/>
         </w:numPr>
         <w:tabs>
-          <w:tab w:val="clear" w:pos="709"/>
           <w:tab w:val="left" w:pos="709" w:leader="none"/>
         </w:tabs>
         <w:bidi w:val="0"/>
@@ -1579,7 +1570,6 @@
           <w:numId w:val="3"/>
         </w:numPr>
         <w:tabs>
-          <w:tab w:val="clear" w:pos="709"/>
           <w:tab w:val="left" w:pos="709" w:leader="none"/>
         </w:tabs>
         <w:bidi w:val="0"/>
@@ -1630,7 +1620,6 @@
           <w:numId w:val="3"/>
         </w:numPr>
         <w:tabs>
-          <w:tab w:val="clear" w:pos="709"/>
           <w:tab w:val="left" w:pos="709" w:leader="none"/>
         </w:tabs>
         <w:bidi w:val="0"/>
@@ -1978,35 +1967,274 @@
     </w:p>
     <w:p>
       <w:pPr>
-        <w:pStyle w:val="Normal"/>
-        <w:bidi w:val="0"/>
-        <w:jc w:val="start"/>
-        <w:rPr/>
-      </w:pPr>
-      <w:r>
-        <w:rPr/>
-      </w:r>
-    </w:p>
-    <w:p>
-      <w:pPr>
-        <w:pStyle w:val="Normal"/>
-        <w:bidi w:val="0"/>
-        <w:jc w:val="start"/>
-        <w:rPr/>
-      </w:pPr>
-      <w:r>
-        <w:rPr/>
-      </w:r>
-    </w:p>
-    <w:p>
-      <w:pPr>
-        <w:pStyle w:val="Normal"/>
-        <w:bidi w:val="0"/>
-        <w:jc w:val="start"/>
-        <w:rPr/>
-      </w:pPr>
-      <w:r>
-        <w:rPr/>
+        <w:pStyle w:val="Subtitle"/>
+        <w:rPr/>
+      </w:pPr>
+      <w:r>
+        <w:rPr/>
+        <w:t>TEST</w:t>
+      </w:r>
+    </w:p>
+    <w:p>
+      <w:pPr>
+        <w:pStyle w:val="Normal"/>
+        <w:bidi w:val="0"/>
+        <w:jc w:val="start"/>
+        <w:rPr/>
+      </w:pPr>
+      <w:r>
+        <w:rPr/>
+      </w:r>
+    </w:p>
+    <w:p>
+      <w:pPr>
+        <w:pStyle w:val="Normal"/>
+        <w:bidi w:val="0"/>
+        <w:jc w:val="start"/>
+        <w:rPr/>
+      </w:pPr>
+      <w:r>
+        <w:rPr/>
+      </w:r>
+    </w:p>
+    <w:p>
+      <w:pPr>
+        <w:pStyle w:val="BodyText"/>
+        <w:bidi w:val="0"/>
+        <w:ind w:hanging="0" w:start="0" w:end="0"/>
+        <w:jc w:val="start"/>
+        <w:rPr/>
+      </w:pPr>
+      <w:r>
+        <w:rPr>
+          <w:rStyle w:val="Strong"/>
+        </w:rPr>
+        <w:t>2-clap program:</w:t>
+      </w:r>
+    </w:p>
+    <w:p>
+      <w:pPr>
+        <w:pStyle w:val="BodyText"/>
+        <w:numPr>
+          <w:ilvl w:val="0"/>
+          <w:numId w:val="6"/>
+        </w:numPr>
+        <w:tabs>
+          <w:tab w:val="clear" w:pos="709"/>
+          <w:tab w:val="left" w:pos="0" w:leader="none"/>
+        </w:tabs>
+        <w:bidi w:val="0"/>
+        <w:spacing w:before="0" w:after="0"/>
+        <w:ind w:hanging="283" w:start="709" w:end="0"/>
+        <w:rPr/>
+      </w:pPr>
+      <w:r>
+        <w:rPr>
+          <w:rStyle w:val="SourceText"/>
+        </w:rPr>
+        <w:t>clap</w:t>
+      </w:r>
+      <w:r>
+        <w:rPr/>
+        <w:t xml:space="preserve"> — single clap, then wait.  </w:t>
+      </w:r>
+      <w:r>
+        <w:rPr/>
+        <w:t>(turn 90 degree)</w:t>
+      </w:r>
+    </w:p>
+    <w:p>
+      <w:pPr>
+        <w:pStyle w:val="BodyText"/>
+        <w:numPr>
+          <w:ilvl w:val="0"/>
+          <w:numId w:val="6"/>
+        </w:numPr>
+        <w:tabs>
+          <w:tab w:val="clear" w:pos="709"/>
+          <w:tab w:val="left" w:pos="0" w:leader="none"/>
+        </w:tabs>
+        <w:bidi w:val="0"/>
+        <w:ind w:hanging="283" w:start="709"/>
+        <w:rPr/>
+      </w:pPr>
+      <w:r>
+        <w:rPr>
+          <w:rStyle w:val="SourceText"/>
+        </w:rPr>
+        <w:t>clapclap</w:t>
+      </w:r>
+      <w:r>
+        <w:rPr/>
+        <w:t xml:space="preserve">, ~0.2 sec apart </w:t>
+      </w:r>
+      <w:r>
+        <w:rPr/>
+        <w:t>(move forward)</w:t>
+      </w:r>
+    </w:p>
+    <w:p>
+      <w:pPr>
+        <w:pStyle w:val="BodyText"/>
+        <w:bidi w:val="0"/>
+        <w:ind w:hanging="0" w:start="0" w:end="0"/>
+        <w:rPr/>
+      </w:pPr>
+      <w:r>
+        <w:rPr>
+          <w:rStyle w:val="Strong"/>
+        </w:rPr>
+        <w:t>3-clap program:</w:t>
+      </w:r>
+    </w:p>
+    <w:p>
+      <w:pPr>
+        <w:pStyle w:val="BodyText"/>
+        <w:numPr>
+          <w:ilvl w:val="0"/>
+          <w:numId w:val="7"/>
+        </w:numPr>
+        <w:tabs>
+          <w:tab w:val="clear" w:pos="709"/>
+          <w:tab w:val="left" w:pos="0" w:leader="none"/>
+        </w:tabs>
+        <w:bidi w:val="0"/>
+        <w:spacing w:before="0" w:after="0"/>
+        <w:ind w:hanging="283" w:start="709" w:end="0"/>
+        <w:rPr/>
+      </w:pPr>
+      <w:r>
+        <w:rPr>
+          <w:rStyle w:val="SourceText"/>
+        </w:rPr>
+        <w:t>clap</w:t>
+      </w:r>
+      <w:r>
+        <w:rPr/>
+        <w:t xml:space="preserve"> — single clap, then wait. </w:t>
+      </w:r>
+    </w:p>
+    <w:p>
+      <w:pPr>
+        <w:pStyle w:val="BodyText"/>
+        <w:numPr>
+          <w:ilvl w:val="0"/>
+          <w:numId w:val="7"/>
+        </w:numPr>
+        <w:tabs>
+          <w:tab w:val="clear" w:pos="709"/>
+          <w:tab w:val="left" w:pos="0" w:leader="none"/>
+        </w:tabs>
+        <w:bidi w:val="0"/>
+        <w:spacing w:before="0" w:after="0"/>
+        <w:ind w:hanging="283" w:start="709"/>
+        <w:rPr/>
+      </w:pPr>
+      <w:r>
+        <w:rPr>
+          <w:rStyle w:val="SourceText"/>
+        </w:rPr>
+        <w:t>clapclap</w:t>
+      </w:r>
+      <w:r>
+        <w:rPr/>
+        <w:t xml:space="preserve">, ~0.2 sec apart — this only exercises the </w:t>
+      </w:r>
+      <w:r>
+        <w:rPr>
+          <w:rStyle w:val="Emphasis"/>
+        </w:rPr>
+        <w:t>outer</w:t>
+      </w:r>
+      <w:r>
+        <w:rPr/>
+        <w:t xml:space="preserve"> if (clap 1 vs clap 2), same as the 2-clap test. </w:t>
+      </w:r>
+    </w:p>
+    <w:p>
+      <w:pPr>
+        <w:pStyle w:val="BodyText"/>
+        <w:numPr>
+          <w:ilvl w:val="0"/>
+          <w:numId w:val="7"/>
+        </w:numPr>
+        <w:tabs>
+          <w:tab w:val="clear" w:pos="709"/>
+          <w:tab w:val="left" w:pos="0" w:leader="none"/>
+        </w:tabs>
+        <w:bidi w:val="0"/>
+        <w:ind w:hanging="283" w:start="709"/>
+        <w:rPr/>
+      </w:pPr>
+      <w:r>
+        <w:rPr>
+          <w:rStyle w:val="SourceText"/>
+        </w:rPr>
+        <w:t>clap</w:t>
+      </w:r>
+      <w:r>
+        <w:rPr/>
+        <w:t xml:space="preserve"> </w:t>
+      </w:r>
+      <w:r>
+        <w:rPr>
+          <w:rStyle w:val="Strong"/>
+        </w:rPr>
+        <w:t>~0.2 sec</w:t>
+      </w:r>
+      <w:r>
+        <w:rPr/>
+        <w:t xml:space="preserve"> </w:t>
+      </w:r>
+      <w:r>
+        <w:rPr>
+          <w:rStyle w:val="SourceText"/>
+        </w:rPr>
+        <w:t>clap</w:t>
+      </w:r>
+      <w:r>
+        <w:rPr/>
+        <w:t xml:space="preserve"> </w:t>
+      </w:r>
+      <w:r>
+        <w:rPr>
+          <w:rStyle w:val="Strong"/>
+        </w:rPr>
+        <w:t>~0.5 sec</w:t>
+      </w:r>
+      <w:r>
+        <w:rPr/>
+        <w:t xml:space="preserve"> </w:t>
+      </w:r>
+      <w:r>
+        <w:rPr>
+          <w:rStyle w:val="SourceText"/>
+        </w:rPr>
+        <w:t>clap</w:t>
+      </w:r>
+      <w:r>
+        <w:rPr/>
+        <w:t xml:space="preserve"> — first gap stays short , and only the </w:t>
+      </w:r>
+      <w:r>
+        <w:rPr>
+          <w:rStyle w:val="Emphasis"/>
+        </w:rPr>
+        <w:t>second</w:t>
+      </w:r>
+      <w:r>
+        <w:rPr/>
+        <w:t xml:space="preserve"> gap widens to ~0.5 sec . So it's uneven spacing, not clap...clap...clap all equally 0.5 apart: </w:t>
+      </w:r>
+      <w:r>
+        <w:rPr>
+          <w:rStyle w:val="Strong"/>
+        </w:rPr>
+        <w:t>clap-clap</w:t>
+      </w:r>
+      <w:r>
+        <w:rPr/>
+        <w:t xml:space="preserve"> close together, then a slightly longer beat before the third clap.</w:t>
       </w:r>
     </w:p>
     <w:p>
@@ -2291,6 +2519,7 @@
       <w:pgNumType w:fmt="decimal"/>
       <w:formProt w:val="false"/>
       <w:textDirection w:val="lrTb"/>
+      <w:docGrid w:type="default" w:linePitch="100" w:charSpace="0"/>
     </w:sectPr>
   </w:body>
 </w:document>
@@ -2328,7 +2557,6 @@
     <w:lvl w:ilvl="2">
       <w:start w:val="1"/>
       <w:numFmt w:val="none"/>
-      <w:pStyle w:val="Heading3"/>
       <w:suff w:val="nothing"/>
       <w:lvlText w:val=""/>
       <w:lvlJc w:val="start"/>
@@ -2964,6 +3192,244 @@
       <w:rPr>
         <w:rFonts w:ascii="Symbol" w:hAnsi="Symbol" w:cs="Symbol" w:hint="default"/>
       </w:rPr>
+    </w:lvl>
+  </w:abstractNum>
+  <w:abstractNum w:abstractNumId="6">
+    <w:lvl w:ilvl="0">
+      <w:start w:val="1"/>
+      <w:numFmt w:val="decimal"/>
+      <w:lvlText w:val="%1."/>
+      <w:lvlJc w:val="start"/>
+      <w:pPr>
+        <w:tabs>
+          <w:tab w:val="num" w:pos="709"/>
+        </w:tabs>
+        <w:ind w:start="709" w:hanging="283"/>
+      </w:pPr>
+      <w:rPr/>
+    </w:lvl>
+    <w:lvl w:ilvl="1">
+      <w:start w:val="1"/>
+      <w:numFmt w:val="decimal"/>
+      <w:lvlText w:val="%2."/>
+      <w:lvlJc w:val="start"/>
+      <w:pPr>
+        <w:tabs>
+          <w:tab w:val="num" w:pos="1418"/>
+        </w:tabs>
+        <w:ind w:start="1418" w:hanging="283"/>
+      </w:pPr>
+      <w:rPr/>
+    </w:lvl>
+    <w:lvl w:ilvl="2">
+      <w:start w:val="1"/>
+      <w:numFmt w:val="decimal"/>
+      <w:lvlText w:val="%3."/>
+      <w:lvlJc w:val="start"/>
+      <w:pPr>
+        <w:tabs>
+          <w:tab w:val="num" w:pos="2127"/>
+        </w:tabs>
+        <w:ind w:start="2127" w:hanging="283"/>
+      </w:pPr>
+      <w:rPr/>
+    </w:lvl>
+    <w:lvl w:ilvl="3">
+      <w:start w:val="1"/>
+      <w:numFmt w:val="decimal"/>
+      <w:lvlText w:val="%4."/>
+      <w:lvlJc w:val="start"/>
+      <w:pPr>
+        <w:tabs>
+          <w:tab w:val="num" w:pos="2836"/>
+        </w:tabs>
+        <w:ind w:start="2836" w:hanging="283"/>
+      </w:pPr>
+      <w:rPr/>
+    </w:lvl>
+    <w:lvl w:ilvl="4">
+      <w:start w:val="1"/>
+      <w:numFmt w:val="decimal"/>
+      <w:lvlText w:val="%5."/>
+      <w:lvlJc w:val="start"/>
+      <w:pPr>
+        <w:tabs>
+          <w:tab w:val="num" w:pos="3545"/>
+        </w:tabs>
+        <w:ind w:start="3545" w:hanging="283"/>
+      </w:pPr>
+      <w:rPr/>
+    </w:lvl>
+    <w:lvl w:ilvl="5">
+      <w:start w:val="1"/>
+      <w:numFmt w:val="decimal"/>
+      <w:lvlText w:val="%6."/>
+      <w:lvlJc w:val="start"/>
+      <w:pPr>
+        <w:tabs>
+          <w:tab w:val="num" w:pos="4254"/>
+        </w:tabs>
+        <w:ind w:start="4254" w:hanging="283"/>
+      </w:pPr>
+      <w:rPr/>
+    </w:lvl>
+    <w:lvl w:ilvl="6">
+      <w:start w:val="1"/>
+      <w:numFmt w:val="decimal"/>
+      <w:lvlText w:val="%7."/>
+      <w:lvlJc w:val="start"/>
+      <w:pPr>
+        <w:tabs>
+          <w:tab w:val="num" w:pos="4963"/>
+        </w:tabs>
+        <w:ind w:start="4963" w:hanging="283"/>
+      </w:pPr>
+      <w:rPr/>
+    </w:lvl>
+    <w:lvl w:ilvl="7">
+      <w:start w:val="1"/>
+      <w:numFmt w:val="decimal"/>
+      <w:lvlText w:val="%8."/>
+      <w:lvlJc w:val="start"/>
+      <w:pPr>
+        <w:tabs>
+          <w:tab w:val="num" w:pos="5672"/>
+        </w:tabs>
+        <w:ind w:start="5672" w:hanging="283"/>
+      </w:pPr>
+      <w:rPr/>
+    </w:lvl>
+    <w:lvl w:ilvl="8">
+      <w:start w:val="1"/>
+      <w:numFmt w:val="decimal"/>
+      <w:lvlText w:val="%9."/>
+      <w:lvlJc w:val="start"/>
+      <w:pPr>
+        <w:tabs>
+          <w:tab w:val="num" w:pos="6381"/>
+        </w:tabs>
+        <w:ind w:start="6381" w:hanging="283"/>
+      </w:pPr>
+      <w:rPr/>
+    </w:lvl>
+  </w:abstractNum>
+  <w:abstractNum w:abstractNumId="7">
+    <w:lvl w:ilvl="0">
+      <w:start w:val="1"/>
+      <w:numFmt w:val="decimal"/>
+      <w:lvlText w:val="%1."/>
+      <w:lvlJc w:val="start"/>
+      <w:pPr>
+        <w:tabs>
+          <w:tab w:val="num" w:pos="709"/>
+        </w:tabs>
+        <w:ind w:start="709" w:hanging="283"/>
+      </w:pPr>
+      <w:rPr/>
+    </w:lvl>
+    <w:lvl w:ilvl="1">
+      <w:start w:val="1"/>
+      <w:numFmt w:val="decimal"/>
+      <w:lvlText w:val="%2."/>
+      <w:lvlJc w:val="start"/>
+      <w:pPr>
+        <w:tabs>
+          <w:tab w:val="num" w:pos="1418"/>
+        </w:tabs>
+        <w:ind w:start="1418" w:hanging="283"/>
+      </w:pPr>
+      <w:rPr/>
+    </w:lvl>
+    <w:lvl w:ilvl="2">
+      <w:start w:val="1"/>
+      <w:numFmt w:val="decimal"/>
+      <w:lvlText w:val="%3."/>
+      <w:lvlJc w:val="start"/>
+      <w:pPr>
+        <w:tabs>
+          <w:tab w:val="num" w:pos="2127"/>
+        </w:tabs>
+        <w:ind w:start="2127" w:hanging="283"/>
+      </w:pPr>
+      <w:rPr/>
+    </w:lvl>
+    <w:lvl w:ilvl="3">
+      <w:start w:val="1"/>
+      <w:numFmt w:val="decimal"/>
+      <w:lvlText w:val="%4."/>
+      <w:lvlJc w:val="start"/>
+      <w:pPr>
+        <w:tabs>
+          <w:tab w:val="num" w:pos="2836"/>
+        </w:tabs>
+        <w:ind w:start="2836" w:hanging="283"/>
+      </w:pPr>
+      <w:rPr/>
+    </w:lvl>
+    <w:lvl w:ilvl="4">
+      <w:start w:val="1"/>
+      <w:numFmt w:val="decimal"/>
+      <w:lvlText w:val="%5."/>
+      <w:lvlJc w:val="start"/>
+      <w:pPr>
+        <w:tabs>
+          <w:tab w:val="num" w:pos="3545"/>
+        </w:tabs>
+        <w:ind w:start="3545" w:hanging="283"/>
+      </w:pPr>
+      <w:rPr/>
+    </w:lvl>
+    <w:lvl w:ilvl="5">
+      <w:start w:val="1"/>
+      <w:numFmt w:val="decimal"/>
+      <w:lvlText w:val="%6."/>
+      <w:lvlJc w:val="start"/>
+      <w:pPr>
+        <w:tabs>
+          <w:tab w:val="num" w:pos="4254"/>
+        </w:tabs>
+        <w:ind w:start="4254" w:hanging="283"/>
+      </w:pPr>
+      <w:rPr/>
+    </w:lvl>
+    <w:lvl w:ilvl="6">
+      <w:start w:val="1"/>
+      <w:numFmt w:val="decimal"/>
+      <w:lvlText w:val="%7."/>
+      <w:lvlJc w:val="start"/>
+      <w:pPr>
+        <w:tabs>
+          <w:tab w:val="num" w:pos="4963"/>
+        </w:tabs>
+        <w:ind w:start="4963" w:hanging="283"/>
+      </w:pPr>
+      <w:rPr/>
+    </w:lvl>
+    <w:lvl w:ilvl="7">
+      <w:start w:val="1"/>
+      <w:numFmt w:val="decimal"/>
+      <w:lvlText w:val="%8."/>
+      <w:lvlJc w:val="start"/>
+      <w:pPr>
+        <w:tabs>
+          <w:tab w:val="num" w:pos="5672"/>
+        </w:tabs>
+        <w:ind w:start="5672" w:hanging="283"/>
+      </w:pPr>
+      <w:rPr/>
+    </w:lvl>
+    <w:lvl w:ilvl="8">
+      <w:start w:val="1"/>
+      <w:numFmt w:val="decimal"/>
+      <w:lvlText w:val="%9."/>
+      <w:lvlJc w:val="start"/>
+      <w:pPr>
+        <w:tabs>
+          <w:tab w:val="num" w:pos="6381"/>
+        </w:tabs>
+        <w:ind w:start="6381" w:hanging="283"/>
+      </w:pPr>
+      <w:rPr/>
     </w:lvl>
   </w:abstractNum>
   <w:num w:numId="1">
@@ -2980,6 +3446,12 @@
   </w:num>
   <w:num w:numId="5">
     <w:abstractNumId w:val="5"/>
+  </w:num>
+  <w:num w:numId="6">
+    <w:abstractNumId w:val="6"/>
+  </w:num>
+  <w:num w:numId="7">
+    <w:abstractNumId w:val="7"/>
   </w:num>
 </w:numbering>
 </file>
@@ -2998,7 +3470,6 @@
     </w:rPrDefault>
     <w:pPrDefault>
       <w:pPr>
-        <w:widowControl/>
         <w:suppressAutoHyphens w:val="true"/>
       </w:pPr>
     </w:pPrDefault>
@@ -3008,7 +3479,10 @@
     <w:qFormat/>
     <w:pPr>
       <w:widowControl/>
+      <w:suppressAutoHyphens w:val="true"/>
       <w:bidi w:val="0"/>
+      <w:spacing w:before="0" w:after="0"/>
+      <w:jc w:val="start"/>
     </w:pPr>
     <w:rPr>
       <w:rFonts w:ascii="Liberation Serif" w:hAnsi="Liberation Serif" w:eastAsia="DejaVu Sans" w:cs="FreeSans"/>
@@ -3052,8 +3526,8 @@
       <w:iCs/>
     </w:rPr>
   </w:style>
-  <w:style w:type="character" w:styleId="Bullets">
-    <w:name w:val="Bullets"/>
+  <w:style w:type="character" w:styleId="Bulletsuser">
+    <w:name w:val="Bullets (user)"/>
     <w:qFormat/>
     <w:rPr>
       <w:rFonts w:ascii="OpenSymbol" w:hAnsi="OpenSymbol" w:eastAsia="OpenSymbol" w:cs="OpenSymbol"/>
@@ -3065,6 +3539,11 @@
     <w:rPr>
       <w:rFonts w:ascii="Liberation Mono" w:hAnsi="Liberation Mono" w:eastAsia="Liberation Mono" w:cs="Liberation Mono"/>
     </w:rPr>
+  </w:style>
+  <w:style w:type="character" w:styleId="NumberingSymbols">
+    <w:name w:val="Numbering Symbols"/>
+    <w:qFormat/>
+    <w:rPr/>
   </w:style>
   <w:style w:type="paragraph" w:styleId="Heading">
     <w:name w:val="Heading"/>

</xml_diff>